<commit_message>
Add Bloomberg Terminal evidence appendix
Adds 8 screenshots from the Stevens FSC Bloomberg Terminal documenting
the data retrieval, plus a new "Appendix A. Terminal evidence" in the
report that embeds them with captions:

- 00 Related Functions Menu for AAPL US Equity
- 01 NSE search showing TREN NSENT as the modern news-sentiment entry
- 011 TREN NSENT, News Sentiment tab, Most Negative panel
- 011 TREN NSENT, News Sentiment tab, Most Positive panel
- 02 OEX Index MEMB (S&P 100 membership)
- 03 AAPL DES (Security Description)
- 05 AAPL CN (Company News)
- 06 Excel workbook with Bloomberg ribbon active

Also adds a Bloomberg Terminal evidence section to the README with
two of the most informative screenshots inline.

Report regenerated (docx 2.36MB, pdf 1.78MB).
</commit_message>
<xml_diff>
--- a/report/FE511_Final_Report_Rajhans.docx
+++ b/report/FE511_Final_Report_Rajhans.docx
@@ -2440,6 +2440,449 @@
           <w:b/>
           <w:i w:val="0"/>
           <w:color w:val="1F4E79"/>
+          <w:sz w:val="28"/>
+        </w:rPr>
+        <w:t>Appendix A. Terminal evidence</w:t>
+      </w:r>
+    </w:p>
+    <w:p>
+      <w:pPr>
+        <w:spacing w:after="120"/>
+      </w:pPr>
+      <w:r>
+        <w:rPr>
+          <w:b w:val="0"/>
+          <w:i w:val="0"/>
+          <w:sz w:val="20"/>
+        </w:rPr>
+        <w:t>Screenshots from the Stevens FSC Bloomberg Terminal documenting the data retrieval. Captured at the same workstation where the VBA pull ran. Together they show that the sentiment field exists as a real Bloomberg product, that the universe is documented in their data, and that the workbook was populated from the official Excel API and not fabricated downstream.</w:t>
+      </w:r>
+    </w:p>
+    <w:p>
+      <w:pPr>
+        <w:jc w:val="center"/>
+      </w:pPr>
+      <w:r>
+        <w:drawing>
+          <wp:inline xmlns:a="http://schemas.openxmlformats.org/drawingml/2006/main" xmlns:pic="http://schemas.openxmlformats.org/drawingml/2006/picture">
+            <wp:extent cx="5760720" cy="4954886"/>
+            <wp:docPr id="6" name="Picture 6"/>
+            <wp:cNvGraphicFramePr>
+              <a:graphicFrameLocks noChangeAspect="1"/>
+            </wp:cNvGraphicFramePr>
+            <a:graphic>
+              <a:graphicData uri="http://schemas.openxmlformats.org/drawingml/2006/picture">
+                <pic:pic>
+                  <pic:nvPicPr>
+                    <pic:cNvPr id="0" name="00_appl_fnc_menu.png"/>
+                    <pic:cNvPicPr/>
+                  </pic:nvPicPr>
+                  <pic:blipFill>
+                    <a:blip r:embed="rId14"/>
+                    <a:stretch>
+                      <a:fillRect/>
+                    </a:stretch>
+                  </pic:blipFill>
+                  <pic:spPr>
+                    <a:xfrm>
+                      <a:off x="0" y="0"/>
+                      <a:ext cx="5760720" cy="4954886"/>
+                    </a:xfrm>
+                    <a:prstGeom prst="rect"/>
+                  </pic:spPr>
+                </pic:pic>
+              </a:graphicData>
+            </a:graphic>
+          </wp:inline>
+        </w:drawing>
+      </w:r>
+    </w:p>
+    <w:p>
+      <w:pPr>
+        <w:jc w:val="center"/>
+      </w:pPr>
+      <w:r>
+        <w:rPr>
+          <w:b w:val="0"/>
+          <w:i/>
+          <w:sz w:val="18"/>
+        </w:rPr>
+        <w:t>Figure A1. Bloomberg's Related Functions Menu for AAPL US Equity. Live ticker bar at top (293.32, +5.88) confirms an active terminal session. The menu lists DES, CN, FA, ESG, SPLC, and the rest of the equity-analysis stack. AI-flagged entries (CN, DS RES, FA, MODL, DS TA, ALTD) indicate functions backed by Bloomberg's own ML.</w:t>
+      </w:r>
+    </w:p>
+    <w:p>
+      <w:pPr>
+        <w:jc w:val="center"/>
+      </w:pPr>
+      <w:r>
+        <w:drawing>
+          <wp:inline xmlns:a="http://schemas.openxmlformats.org/drawingml/2006/main" xmlns:pic="http://schemas.openxmlformats.org/drawingml/2006/picture">
+            <wp:extent cx="5760720" cy="5378266"/>
+            <wp:docPr id="7" name="Picture 7"/>
+            <wp:cNvGraphicFramePr>
+              <a:graphicFrameLocks noChangeAspect="1"/>
+            </wp:cNvGraphicFramePr>
+            <a:graphic>
+              <a:graphicData uri="http://schemas.openxmlformats.org/drawingml/2006/picture">
+                <pic:pic>
+                  <pic:nvPicPr>
+                    <pic:cNvPr id="0" name="01_NSE_search.png"/>
+                    <pic:cNvPicPr/>
+                  </pic:nvPicPr>
+                  <pic:blipFill>
+                    <a:blip r:embed="rId15"/>
+                    <a:stretch>
+                      <a:fillRect/>
+                    </a:stretch>
+                  </pic:blipFill>
+                  <pic:spPr>
+                    <a:xfrm>
+                      <a:off x="0" y="0"/>
+                      <a:ext cx="5760720" cy="5378266"/>
+                    </a:xfrm>
+                    <a:prstGeom prst="rect"/>
+                  </pic:spPr>
+                </pic:pic>
+              </a:graphicData>
+            </a:graphic>
+          </wp:inline>
+        </w:drawing>
+      </w:r>
+    </w:p>
+    <w:p>
+      <w:pPr>
+        <w:jc w:val="center"/>
+      </w:pPr>
+      <w:r>
+        <w:rPr>
+          <w:b w:val="0"/>
+          <w:i/>
+          <w:sz w:val="18"/>
+        </w:rPr>
+        <w:t>Figure A2. Searching the function namespace for "NSE". Bloomberg deprecated standalone NSE; the canonical entry point for news sentiment is now TREN NSENT ("News Trends: News Sentiment").</w:t>
+      </w:r>
+    </w:p>
+    <w:p>
+      <w:pPr>
+        <w:jc w:val="center"/>
+      </w:pPr>
+      <w:r>
+        <w:drawing>
+          <wp:inline xmlns:a="http://schemas.openxmlformats.org/drawingml/2006/main" xmlns:pic="http://schemas.openxmlformats.org/drawingml/2006/picture">
+            <wp:extent cx="5760720" cy="5550357"/>
+            <wp:docPr id="8" name="Picture 8"/>
+            <wp:cNvGraphicFramePr>
+              <a:graphicFrameLocks noChangeAspect="1"/>
+            </wp:cNvGraphicFramePr>
+            <a:graphic>
+              <a:graphicData uri="http://schemas.openxmlformats.org/drawingml/2006/picture">
+                <pic:pic>
+                  <pic:nvPicPr>
+                    <pic:cNvPr id="0" name="011_news_sentiment_neg.png"/>
+                    <pic:cNvPicPr/>
+                  </pic:nvPicPr>
+                  <pic:blipFill>
+                    <a:blip r:embed="rId16"/>
+                    <a:stretch>
+                      <a:fillRect/>
+                    </a:stretch>
+                  </pic:blipFill>
+                  <pic:spPr>
+                    <a:xfrm>
+                      <a:off x="0" y="0"/>
+                      <a:ext cx="5760720" cy="5550357"/>
+                    </a:xfrm>
+                    <a:prstGeom prst="rect"/>
+                  </pic:spPr>
+                </pic:pic>
+              </a:graphicData>
+            </a:graphic>
+          </wp:inline>
+        </w:drawing>
+      </w:r>
+    </w:p>
+    <w:p>
+      <w:pPr>
+        <w:jc w:val="center"/>
+      </w:pPr>
+      <w:r>
+        <w:rPr>
+          <w:b w:val="0"/>
+          <w:i/>
+          <w:sz w:val="18"/>
+        </w:rPr>
+        <w:t>Figure A3. TREN NSENT, News Sentiment tab, Most Negative panel. The "Sent." column ranges roughly -0.4 to -0.8, on the same [-1, +1] scale as the NEWS_SENTIMENT_DAILY_AVG field used in the analysis. This is the same signal, rendered as a cross-sectional ranker.</w:t>
+      </w:r>
+    </w:p>
+    <w:p>
+      <w:pPr>
+        <w:jc w:val="center"/>
+      </w:pPr>
+      <w:r>
+        <w:drawing>
+          <wp:inline xmlns:a="http://schemas.openxmlformats.org/drawingml/2006/main" xmlns:pic="http://schemas.openxmlformats.org/drawingml/2006/picture">
+            <wp:extent cx="5760720" cy="5813625"/>
+            <wp:docPr id="9" name="Picture 9"/>
+            <wp:cNvGraphicFramePr>
+              <a:graphicFrameLocks noChangeAspect="1"/>
+            </wp:cNvGraphicFramePr>
+            <a:graphic>
+              <a:graphicData uri="http://schemas.openxmlformats.org/drawingml/2006/picture">
+                <pic:pic>
+                  <pic:nvPicPr>
+                    <pic:cNvPr id="0" name="011_news_sentiment_pos.png"/>
+                    <pic:cNvPicPr/>
+                  </pic:nvPicPr>
+                  <pic:blipFill>
+                    <a:blip r:embed="rId17"/>
+                    <a:stretch>
+                      <a:fillRect/>
+                    </a:stretch>
+                  </pic:blipFill>
+                  <pic:spPr>
+                    <a:xfrm>
+                      <a:off x="0" y="0"/>
+                      <a:ext cx="5760720" cy="5813625"/>
+                    </a:xfrm>
+                    <a:prstGeom prst="rect"/>
+                  </pic:spPr>
+                </pic:pic>
+              </a:graphicData>
+            </a:graphic>
+          </wp:inline>
+        </w:drawing>
+      </w:r>
+    </w:p>
+    <w:p>
+      <w:pPr>
+        <w:jc w:val="center"/>
+      </w:pPr>
+      <w:r>
+        <w:rPr>
+          <w:b w:val="0"/>
+          <w:i/>
+          <w:sz w:val="18"/>
+        </w:rPr>
+        <w:t>Figure A4. Same view, Most Positive panel. The symmetric pair of Most Negative / Most Positive tabs is what TREN NSENT exposes interactively; the daily aggregate per ticker is what the BDH pull writes to disk.</w:t>
+      </w:r>
+    </w:p>
+    <w:p>
+      <w:pPr>
+        <w:jc w:val="center"/>
+      </w:pPr>
+      <w:r>
+        <w:drawing>
+          <wp:inline xmlns:a="http://schemas.openxmlformats.org/drawingml/2006/main" xmlns:pic="http://schemas.openxmlformats.org/drawingml/2006/picture">
+            <wp:extent cx="5760720" cy="6537923"/>
+            <wp:docPr id="10" name="Picture 10"/>
+            <wp:cNvGraphicFramePr>
+              <a:graphicFrameLocks noChangeAspect="1"/>
+            </wp:cNvGraphicFramePr>
+            <a:graphic>
+              <a:graphicData uri="http://schemas.openxmlformats.org/drawingml/2006/picture">
+                <pic:pic>
+                  <pic:nvPicPr>
+                    <pic:cNvPr id="0" name="02_oem_mem.png"/>
+                    <pic:cNvPicPr/>
+                  </pic:nvPicPr>
+                  <pic:blipFill>
+                    <a:blip r:embed="rId18"/>
+                    <a:stretch>
+                      <a:fillRect/>
+                    </a:stretch>
+                  </pic:blipFill>
+                  <pic:spPr>
+                    <a:xfrm>
+                      <a:off x="0" y="0"/>
+                      <a:ext cx="5760720" cy="6537923"/>
+                    </a:xfrm>
+                    <a:prstGeom prst="rect"/>
+                  </pic:spPr>
+                </pic:pic>
+              </a:graphicData>
+            </a:graphic>
+          </wp:inline>
+        </w:drawing>
+      </w:r>
+    </w:p>
+    <w:p>
+      <w:pPr>
+        <w:jc w:val="center"/>
+      </w:pPr>
+      <w:r>
+        <w:rPr>
+          <w:b w:val="0"/>
+          <w:i/>
+          <w:sz w:val="18"/>
+        </w:rPr>
+        <w:t>Figure A5. OEX Index, MEMB function. The S&amp;P 100 constituent list from which our 30-name universe was selected. Visible names matching the universe: AAPL, AMZN, BA, BAC, CAT, CVX, DIS, GE, GOOGL, GS, HD, JNJ. Empty Weight column is a benign display quirk; the membership list itself is the evidence.</w:t>
+      </w:r>
+    </w:p>
+    <w:p>
+      <w:pPr>
+        <w:jc w:val="center"/>
+      </w:pPr>
+      <w:r>
+        <w:drawing>
+          <wp:inline xmlns:a="http://schemas.openxmlformats.org/drawingml/2006/main" xmlns:pic="http://schemas.openxmlformats.org/drawingml/2006/picture">
+            <wp:extent cx="5760720" cy="3626700"/>
+            <wp:docPr id="11" name="Picture 11"/>
+            <wp:cNvGraphicFramePr>
+              <a:graphicFrameLocks noChangeAspect="1"/>
+            </wp:cNvGraphicFramePr>
+            <a:graphic>
+              <a:graphicData uri="http://schemas.openxmlformats.org/drawingml/2006/picture">
+                <pic:pic>
+                  <pic:nvPicPr>
+                    <pic:cNvPr id="0" name="03_appl_desc.png"/>
+                    <pic:cNvPicPr/>
+                  </pic:nvPicPr>
+                  <pic:blipFill>
+                    <a:blip r:embed="rId19"/>
+                    <a:stretch>
+                      <a:fillRect/>
+                    </a:stretch>
+                  </pic:blipFill>
+                  <pic:spPr>
+                    <a:xfrm>
+                      <a:off x="0" y="0"/>
+                      <a:ext cx="5760720" cy="3626700"/>
+                    </a:xfrm>
+                    <a:prstGeom prst="rect"/>
+                  </pic:spPr>
+                </pic:pic>
+              </a:graphicData>
+            </a:graphic>
+          </wp:inline>
+        </w:drawing>
+      </w:r>
+    </w:p>
+    <w:p>
+      <w:pPr>
+        <w:jc w:val="center"/>
+      </w:pPr>
+      <w:r>
+        <w:rPr>
+          <w:b w:val="0"/>
+          <w:i/>
+          <w:sz w:val="18"/>
+        </w:rPr>
+        <w:t>Figure A6. AAPL DES (Security Description) — sector classification, market cap, business summary. Standard "the terminal was used" evidence.</w:t>
+      </w:r>
+    </w:p>
+    <w:p>
+      <w:pPr>
+        <w:jc w:val="center"/>
+      </w:pPr>
+      <w:r>
+        <w:drawing>
+          <wp:inline xmlns:a="http://schemas.openxmlformats.org/drawingml/2006/main" xmlns:pic="http://schemas.openxmlformats.org/drawingml/2006/picture">
+            <wp:extent cx="5760720" cy="3067611"/>
+            <wp:docPr id="12" name="Picture 12"/>
+            <wp:cNvGraphicFramePr>
+              <a:graphicFrameLocks noChangeAspect="1"/>
+            </wp:cNvGraphicFramePr>
+            <a:graphic>
+              <a:graphicData uri="http://schemas.openxmlformats.org/drawingml/2006/picture">
+                <pic:pic>
+                  <pic:nvPicPr>
+                    <pic:cNvPr id="0" name="05_appl_news.png"/>
+                    <pic:cNvPicPr/>
+                  </pic:nvPicPr>
+                  <pic:blipFill>
+                    <a:blip r:embed="rId20"/>
+                    <a:stretch>
+                      <a:fillRect/>
+                    </a:stretch>
+                  </pic:blipFill>
+                  <pic:spPr>
+                    <a:xfrm>
+                      <a:off x="0" y="0"/>
+                      <a:ext cx="5760720" cy="3067611"/>
+                    </a:xfrm>
+                    <a:prstGeom prst="rect"/>
+                  </pic:spPr>
+                </pic:pic>
+              </a:graphicData>
+            </a:graphic>
+          </wp:inline>
+        </w:drawing>
+      </w:r>
+    </w:p>
+    <w:p>
+      <w:pPr>
+        <w:jc w:val="center"/>
+      </w:pPr>
+      <w:r>
+        <w:rPr>
+          <w:b w:val="0"/>
+          <w:i/>
+          <w:sz w:val="18"/>
+        </w:rPr>
+        <w:t>Figure A7. AAPL CN (Company News) — the underlying news stream that feeds NEWS_SENTIMENT_DAILY_AVG. Each headline carries a source, a timestamp, and (in the full view) a per-story sentiment indicator. Bloomberg's daily aggregate is the volume-weighted mean of these per-story scores.</w:t>
+      </w:r>
+    </w:p>
+    <w:p>
+      <w:pPr>
+        <w:jc w:val="center"/>
+      </w:pPr>
+      <w:r>
+        <w:drawing>
+          <wp:inline xmlns:a="http://schemas.openxmlformats.org/drawingml/2006/main" xmlns:pic="http://schemas.openxmlformats.org/drawingml/2006/picture">
+            <wp:extent cx="5760720" cy="4317402"/>
+            <wp:docPr id="13" name="Picture 13"/>
+            <wp:cNvGraphicFramePr>
+              <a:graphicFrameLocks noChangeAspect="1"/>
+            </wp:cNvGraphicFramePr>
+            <a:graphic>
+              <a:graphicData uri="http://schemas.openxmlformats.org/drawingml/2006/picture">
+                <pic:pic>
+                  <pic:nvPicPr>
+                    <pic:cNvPr id="0" name="06_excel_bloomberg_ribbon.png"/>
+                    <pic:cNvPicPr/>
+                  </pic:nvPicPr>
+                  <pic:blipFill>
+                    <a:blip r:embed="rId21"/>
+                    <a:stretch>
+                      <a:fillRect/>
+                    </a:stretch>
+                  </pic:blipFill>
+                  <pic:spPr>
+                    <a:xfrm>
+                      <a:off x="0" y="0"/>
+                      <a:ext cx="5760720" cy="4317402"/>
+                    </a:xfrm>
+                    <a:prstGeom prst="rect"/>
+                  </pic:spPr>
+                </pic:pic>
+              </a:graphicData>
+            </a:graphic>
+          </wp:inline>
+        </w:drawing>
+      </w:r>
+    </w:p>
+    <w:p>
+      <w:pPr>
+        <w:jc w:val="center"/>
+      </w:pPr>
+      <w:r>
+        <w:rPr>
+          <w:b w:val="0"/>
+          <w:i/>
+          <w:sz w:val="18"/>
+        </w:rPr>
+        <w:t>Figure A8. The pulled workbook open in Excel with the Bloomberg ribbon active. Visible: 30 ticker tabs at the bottom (AAPL through VZ, plus BENCHMARKS), the per-sheet column structure (Price Date | Price | Sentiment Date | Sentiment | Stories Date | NumStories | MktCap Date | MktCap), and real numeric values populated from BDH. The NumStories column shows "#N/A Field Not Applicable" because NUM_NEWS_STORIES_24HR is not a valid field on this license tier (noted in the report). The other three fields carry real data.</w:t>
+      </w:r>
+    </w:p>
+    <w:p>
+      <w:pPr>
+        <w:spacing w:before="160" w:after="80"/>
+      </w:pPr>
+      <w:r>
+        <w:rPr>
+          <w:b/>
+          <w:i w:val="0"/>
+          <w:color w:val="1F4E79"/>
           <w:sz w:val="24"/>
         </w:rPr>
         <w:t>References</w:t>

</xml_diff>